<commit_message>
feat: flatten nested array using flat() with depth 2
</commit_message>
<xml_diff>
--- a/10_DAILY_LOGS/2_Practice.docx
+++ b/10_DAILY_LOGS/2_Practice.docx
@@ -770,6 +770,7 @@
           <w:rFonts w:ascii="Segoe UI Emoji" w:hAnsi="Segoe UI Emoji" w:cs="Segoe UI Emoji"/>
           <w:b/>
           <w:bCs/>
+          <w:highlight w:val="green"/>
         </w:rPr>
         <w:t>🔵</w:t>
       </w:r>
@@ -777,6 +778,7 @@
         <w:rPr>
           <w:b/>
           <w:bCs/>
+          <w:highlight w:val="green"/>
         </w:rPr>
         <w:t xml:space="preserve"> 3️</w:t>
       </w:r>
@@ -785,6 +787,7 @@
           <w:rFonts w:ascii="Segoe UI Symbol" w:hAnsi="Segoe UI Symbol" w:cs="Segoe UI Symbol"/>
           <w:b/>
           <w:bCs/>
+          <w:highlight w:val="green"/>
         </w:rPr>
         <w:t>⃣</w:t>
       </w:r>
@@ -792,6 +795,7 @@
         <w:rPr>
           <w:b/>
           <w:bCs/>
+          <w:highlight w:val="green"/>
         </w:rPr>
         <w:t xml:space="preserve"> Practice Problem: Flatten an Array</w:t>
       </w:r>

</xml_diff>